<commit_message>
added feature that will ask what month or is it a semestral
</commit_message>
<xml_diff>
--- a/output/CSM_Report_Internal_May.docx
+++ b/output/CSM_Report_Internal_May.docx
@@ -19,7 +19,7 @@
         <w:jc w:val="center"/>
       </w:pPr>
       <w:r>
-        <w:t>Clinic</w:t>
+        <w:t>Library</w:t>
       </w:r>
       <w:r>
         <w:br/>
@@ -33,7 +33,7 @@
           <w:b/>
           <w:sz w:val="24"/>
         </w:rPr>
-        <w:t>Total Respondents: 188</w:t>
+        <w:t>Total Respondents: 422</w:t>
       </w:r>
     </w:p>
     <w:p>
@@ -95,27 +95,27 @@
           </w:tcPr>
           <w:p>
             <w:r>
-              <w:t>Issuance of Medical Clearance</w:t>
-            </w:r>
-          </w:p>
-        </w:tc>
-        <w:tc>
-          <w:tcPr>
-            <w:tcW w:w="3504" w:type="dxa"/>
-          </w:tcPr>
-          <w:p>
-            <w:r>
-              <w:t>164</w:t>
-            </w:r>
-          </w:p>
-        </w:tc>
-        <w:tc>
-          <w:tcPr>
-            <w:tcW w:w="3504" w:type="dxa"/>
-          </w:tcPr>
-          <w:p>
-            <w:r>
-              <w:t>87.23%</w:t>
+              <w:t>Provision of Learning Spaces</w:t>
+            </w:r>
+          </w:p>
+        </w:tc>
+        <w:tc>
+          <w:tcPr>
+            <w:tcW w:w="3504" w:type="dxa"/>
+          </w:tcPr>
+          <w:p>
+            <w:r>
+              <w:t>215</w:t>
+            </w:r>
+          </w:p>
+        </w:tc>
+        <w:tc>
+          <w:tcPr>
+            <w:tcW w:w="3504" w:type="dxa"/>
+          </w:tcPr>
+          <w:p>
+            <w:r>
+              <w:t>50.95%</w:t>
             </w:r>
           </w:p>
         </w:tc>
@@ -127,27 +127,27 @@
           </w:tcPr>
           <w:p>
             <w:r>
-              <w:t>Medical Consultation</w:t>
-            </w:r>
-          </w:p>
-        </w:tc>
-        <w:tc>
-          <w:tcPr>
-            <w:tcW w:w="3504" w:type="dxa"/>
-          </w:tcPr>
-          <w:p>
-            <w:r>
-              <w:t>14</w:t>
-            </w:r>
-          </w:p>
-        </w:tc>
-        <w:tc>
-          <w:tcPr>
-            <w:tcW w:w="3504" w:type="dxa"/>
-          </w:tcPr>
-          <w:p>
-            <w:r>
-              <w:t>7.45%</w:t>
+              <w:t>Did not specify</w:t>
+            </w:r>
+          </w:p>
+        </w:tc>
+        <w:tc>
+          <w:tcPr>
+            <w:tcW w:w="3504" w:type="dxa"/>
+          </w:tcPr>
+          <w:p>
+            <w:r>
+              <w:t>152</w:t>
+            </w:r>
+          </w:p>
+        </w:tc>
+        <w:tc>
+          <w:tcPr>
+            <w:tcW w:w="3504" w:type="dxa"/>
+          </w:tcPr>
+          <w:p>
+            <w:r>
+              <w:t>36.02%</w:t>
             </w:r>
           </w:p>
         </w:tc>
@@ -159,27 +159,27 @@
           </w:tcPr>
           <w:p>
             <w:r>
-              <w:t>Did not specify</w:t>
-            </w:r>
-          </w:p>
-        </w:tc>
-        <w:tc>
-          <w:tcPr>
-            <w:tcW w:w="3504" w:type="dxa"/>
-          </w:tcPr>
-          <w:p>
-            <w:r>
-              <w:t>7</w:t>
-            </w:r>
-          </w:p>
-        </w:tc>
-        <w:tc>
-          <w:tcPr>
-            <w:tcW w:w="3504" w:type="dxa"/>
-          </w:tcPr>
-          <w:p>
-            <w:r>
-              <w:t>3.72%</w:t>
+              <w:t>Circulation-Borrowing Services</w:t>
+            </w:r>
+          </w:p>
+        </w:tc>
+        <w:tc>
+          <w:tcPr>
+            <w:tcW w:w="3504" w:type="dxa"/>
+          </w:tcPr>
+          <w:p>
+            <w:r>
+              <w:t>54</w:t>
+            </w:r>
+          </w:p>
+        </w:tc>
+        <w:tc>
+          <w:tcPr>
+            <w:tcW w:w="3504" w:type="dxa"/>
+          </w:tcPr>
+          <w:p>
+            <w:r>
+              <w:t>12.80%</w:t>
             </w:r>
           </w:p>
         </w:tc>
@@ -191,27 +191,27 @@
           </w:tcPr>
           <w:p>
             <w:r>
-              <w:t>Issuance of Medical Excuse Letter</w:t>
-            </w:r>
-          </w:p>
-        </w:tc>
-        <w:tc>
-          <w:tcPr>
-            <w:tcW w:w="3504" w:type="dxa"/>
-          </w:tcPr>
-          <w:p>
-            <w:r>
-              <w:t>3</w:t>
-            </w:r>
-          </w:p>
-        </w:tc>
-        <w:tc>
-          <w:tcPr>
-            <w:tcW w:w="3504" w:type="dxa"/>
-          </w:tcPr>
-          <w:p>
-            <w:r>
-              <w:t>1.60%</w:t>
+              <w:t>Signing of Clearance</w:t>
+            </w:r>
+          </w:p>
+        </w:tc>
+        <w:tc>
+          <w:tcPr>
+            <w:tcW w:w="3504" w:type="dxa"/>
+          </w:tcPr>
+          <w:p>
+            <w:r>
+              <w:t>1</w:t>
+            </w:r>
+          </w:p>
+        </w:tc>
+        <w:tc>
+          <w:tcPr>
+            <w:tcW w:w="3504" w:type="dxa"/>
+          </w:tcPr>
+          <w:p>
+            <w:r>
+              <w:t>0.24%</w:t>
             </w:r>
           </w:p>
         </w:tc>
@@ -233,7 +233,7 @@
           </w:tcPr>
           <w:p>
             <w:r>
-              <w:t>188</w:t>
+              <w:t>422</w:t>
             </w:r>
           </w:p>
         </w:tc>
@@ -265,7 +265,7 @@
           </w:tcPr>
           <w:p>
             <w:r>
-              <w:t>188 / 188</w:t>
+              <w:t>422 / 422</w:t>
             </w:r>
           </w:p>
         </w:tc>
@@ -351,17 +351,17 @@
           </w:tcPr>
           <w:p>
             <w:r>
-              <w:t>129</w:t>
-            </w:r>
-          </w:p>
-        </w:tc>
-        <w:tc>
-          <w:tcPr>
-            <w:tcW w:w="3504" w:type="dxa"/>
-          </w:tcPr>
-          <w:p>
-            <w:r>
-              <w:t>68.62%</w:t>
+              <w:t>389</w:t>
+            </w:r>
+          </w:p>
+        </w:tc>
+        <w:tc>
+          <w:tcPr>
+            <w:tcW w:w="3504" w:type="dxa"/>
+          </w:tcPr>
+          <w:p>
+            <w:r>
+              <w:t>92.18%</w:t>
             </w:r>
           </w:p>
         </w:tc>
@@ -383,17 +383,17 @@
           </w:tcPr>
           <w:p>
             <w:r>
-              <w:t>57</w:t>
-            </w:r>
-          </w:p>
-        </w:tc>
-        <w:tc>
-          <w:tcPr>
-            <w:tcW w:w="3504" w:type="dxa"/>
-          </w:tcPr>
-          <w:p>
-            <w:r>
-              <w:t>30.32%</w:t>
+              <w:t>29</w:t>
+            </w:r>
+          </w:p>
+        </w:tc>
+        <w:tc>
+          <w:tcPr>
+            <w:tcW w:w="3504" w:type="dxa"/>
+          </w:tcPr>
+          <w:p>
+            <w:r>
+              <w:t>6.87%</w:t>
             </w:r>
           </w:p>
         </w:tc>
@@ -415,17 +415,17 @@
           </w:tcPr>
           <w:p>
             <w:r>
-              <w:t>2</w:t>
-            </w:r>
-          </w:p>
-        </w:tc>
-        <w:tc>
-          <w:tcPr>
-            <w:tcW w:w="3504" w:type="dxa"/>
-          </w:tcPr>
-          <w:p>
-            <w:r>
-              <w:t>1.06%</w:t>
+              <w:t>4</w:t>
+            </w:r>
+          </w:p>
+        </w:tc>
+        <w:tc>
+          <w:tcPr>
+            <w:tcW w:w="3504" w:type="dxa"/>
+          </w:tcPr>
+          <w:p>
+            <w:r>
+              <w:t>0.95%</w:t>
             </w:r>
           </w:p>
         </w:tc>
@@ -447,7 +447,7 @@
           </w:tcPr>
           <w:p>
             <w:r>
-              <w:t>188</w:t>
+              <w:t>422</w:t>
             </w:r>
           </w:p>
         </w:tc>
@@ -479,7 +479,7 @@
           </w:tcPr>
           <w:p>
             <w:r>
-              <w:t>188 / 188</w:t>
+              <w:t>422 / 422</w:t>
             </w:r>
           </w:p>
         </w:tc>
@@ -565,17 +565,17 @@
           </w:tcPr>
           <w:p>
             <w:r>
-              <w:t>90</w:t>
-            </w:r>
-          </w:p>
-        </w:tc>
-        <w:tc>
-          <w:tcPr>
-            <w:tcW w:w="3504" w:type="dxa"/>
-          </w:tcPr>
-          <w:p>
-            <w:r>
-              <w:t>47.87%</w:t>
+              <w:t>234</w:t>
+            </w:r>
+          </w:p>
+        </w:tc>
+        <w:tc>
+          <w:tcPr>
+            <w:tcW w:w="3504" w:type="dxa"/>
+          </w:tcPr>
+          <w:p>
+            <w:r>
+              <w:t>55.45%</w:t>
             </w:r>
           </w:p>
         </w:tc>
@@ -597,17 +597,17 @@
           </w:tcPr>
           <w:p>
             <w:r>
-              <w:t>50</w:t>
-            </w:r>
-          </w:p>
-        </w:tc>
-        <w:tc>
-          <w:tcPr>
-            <w:tcW w:w="3504" w:type="dxa"/>
-          </w:tcPr>
-          <w:p>
-            <w:r>
-              <w:t>26.60%</w:t>
+              <w:t>97</w:t>
+            </w:r>
+          </w:p>
+        </w:tc>
+        <w:tc>
+          <w:tcPr>
+            <w:tcW w:w="3504" w:type="dxa"/>
+          </w:tcPr>
+          <w:p>
+            <w:r>
+              <w:t>22.99%</w:t>
             </w:r>
           </w:p>
         </w:tc>
@@ -629,17 +629,17 @@
           </w:tcPr>
           <w:p>
             <w:r>
-              <w:t>48</w:t>
-            </w:r>
-          </w:p>
-        </w:tc>
-        <w:tc>
-          <w:tcPr>
-            <w:tcW w:w="3504" w:type="dxa"/>
-          </w:tcPr>
-          <w:p>
-            <w:r>
-              <w:t>25.53%</w:t>
+              <w:t>91</w:t>
+            </w:r>
+          </w:p>
+        </w:tc>
+        <w:tc>
+          <w:tcPr>
+            <w:tcW w:w="3504" w:type="dxa"/>
+          </w:tcPr>
+          <w:p>
+            <w:r>
+              <w:t>21.56%</w:t>
             </w:r>
           </w:p>
         </w:tc>
@@ -661,7 +661,7 @@
           </w:tcPr>
           <w:p>
             <w:r>
-              <w:t>188</w:t>
+              <w:t>422</w:t>
             </w:r>
           </w:p>
         </w:tc>
@@ -693,7 +693,7 @@
           </w:tcPr>
           <w:p>
             <w:r>
-              <w:t>188 / 188</w:t>
+              <w:t>422 / 422</w:t>
             </w:r>
           </w:p>
         </w:tc>
@@ -779,17 +779,17 @@
           </w:tcPr>
           <w:p>
             <w:r>
-              <w:t>26</w:t>
-            </w:r>
-          </w:p>
-        </w:tc>
-        <w:tc>
-          <w:tcPr>
-            <w:tcW w:w="3504" w:type="dxa"/>
-          </w:tcPr>
-          <w:p>
-            <w:r>
-              <w:t>13.83%</w:t>
+              <w:t>118</w:t>
+            </w:r>
+          </w:p>
+        </w:tc>
+        <w:tc>
+          <w:tcPr>
+            <w:tcW w:w="3504" w:type="dxa"/>
+          </w:tcPr>
+          <w:p>
+            <w:r>
+              <w:t>27.96%</w:t>
             </w:r>
           </w:p>
         </w:tc>
@@ -811,17 +811,17 @@
           </w:tcPr>
           <w:p>
             <w:r>
-              <w:t>98</w:t>
-            </w:r>
-          </w:p>
-        </w:tc>
-        <w:tc>
-          <w:tcPr>
-            <w:tcW w:w="3504" w:type="dxa"/>
-          </w:tcPr>
-          <w:p>
-            <w:r>
-              <w:t>52.13%</w:t>
+              <w:t>203</w:t>
+            </w:r>
+          </w:p>
+        </w:tc>
+        <w:tc>
+          <w:tcPr>
+            <w:tcW w:w="3504" w:type="dxa"/>
+          </w:tcPr>
+          <w:p>
+            <w:r>
+              <w:t>48.10%</w:t>
             </w:r>
           </w:p>
         </w:tc>
@@ -843,17 +843,17 @@
           </w:tcPr>
           <w:p>
             <w:r>
-              <w:t>0</w:t>
-            </w:r>
-          </w:p>
-        </w:tc>
-        <w:tc>
-          <w:tcPr>
-            <w:tcW w:w="3504" w:type="dxa"/>
-          </w:tcPr>
-          <w:p>
-            <w:r>
-              <w:t>0.00%</w:t>
+              <w:t>5</w:t>
+            </w:r>
+          </w:p>
+        </w:tc>
+        <w:tc>
+          <w:tcPr>
+            <w:tcW w:w="3504" w:type="dxa"/>
+          </w:tcPr>
+          <w:p>
+            <w:r>
+              <w:t>1.18%</w:t>
             </w:r>
           </w:p>
         </w:tc>
@@ -907,17 +907,17 @@
           </w:tcPr>
           <w:p>
             <w:r>
-              <w:t>1</w:t>
-            </w:r>
-          </w:p>
-        </w:tc>
-        <w:tc>
-          <w:tcPr>
-            <w:tcW w:w="3504" w:type="dxa"/>
-          </w:tcPr>
-          <w:p>
-            <w:r>
-              <w:t>0.53%</w:t>
+              <w:t>0</w:t>
+            </w:r>
+          </w:p>
+        </w:tc>
+        <w:tc>
+          <w:tcPr>
+            <w:tcW w:w="3504" w:type="dxa"/>
+          </w:tcPr>
+          <w:p>
+            <w:r>
+              <w:t>0.00%</w:t>
             </w:r>
           </w:p>
         </w:tc>
@@ -939,17 +939,17 @@
           </w:tcPr>
           <w:p>
             <w:r>
-              <w:t>63</w:t>
-            </w:r>
-          </w:p>
-        </w:tc>
-        <w:tc>
-          <w:tcPr>
-            <w:tcW w:w="3504" w:type="dxa"/>
-          </w:tcPr>
-          <w:p>
-            <w:r>
-              <w:t>33.51%</w:t>
+              <w:t>96</w:t>
+            </w:r>
+          </w:p>
+        </w:tc>
+        <w:tc>
+          <w:tcPr>
+            <w:tcW w:w="3504" w:type="dxa"/>
+          </w:tcPr>
+          <w:p>
+            <w:r>
+              <w:t>22.75%</w:t>
             </w:r>
           </w:p>
         </w:tc>
@@ -971,7 +971,7 @@
           </w:tcPr>
           <w:p>
             <w:r>
-              <w:t>188</w:t>
+              <w:t>422</w:t>
             </w:r>
           </w:p>
         </w:tc>
@@ -1003,7 +1003,7 @@
           </w:tcPr>
           <w:p>
             <w:r>
-              <w:t>188 / 188</w:t>
+              <w:t>422 / 422</w:t>
             </w:r>
           </w:p>
         </w:tc>
@@ -1074,36 +1074,33 @@
         </w:tc>
       </w:tr>
       <w:tr>
-        <w:trPr>
-          <w:trHeight w:val="179"/>
-        </w:trPr>
-        <w:tc>
-          <w:tcPr>
-            <w:tcW w:w="3504" w:type="dxa"/>
-          </w:tcPr>
-          <w:p>
-            <w:r>
-              <w:t>Did not specify</w:t>
-            </w:r>
-          </w:p>
-        </w:tc>
-        <w:tc>
-          <w:tcPr>
-            <w:tcW w:w="3504" w:type="dxa"/>
-          </w:tcPr>
-          <w:p>
-            <w:r>
-              <w:t>164</w:t>
-            </w:r>
-          </w:p>
-        </w:tc>
-        <w:tc>
-          <w:tcPr>
-            <w:tcW w:w="3504" w:type="dxa"/>
-          </w:tcPr>
-          <w:p>
-            <w:r>
-              <w:t>87.23%</w:t>
+        <w:tc>
+          <w:tcPr>
+            <w:tcW w:w="3504" w:type="dxa"/>
+          </w:tcPr>
+          <w:p>
+            <w:r>
+              <w:t>Region XIII</w:t>
+            </w:r>
+          </w:p>
+        </w:tc>
+        <w:tc>
+          <w:tcPr>
+            <w:tcW w:w="3504" w:type="dxa"/>
+          </w:tcPr>
+          <w:p>
+            <w:r>
+              <w:t>349</w:t>
+            </w:r>
+          </w:p>
+        </w:tc>
+        <w:tc>
+          <w:tcPr>
+            <w:tcW w:w="3504" w:type="dxa"/>
+          </w:tcPr>
+          <w:p>
+            <w:r>
+              <w:t>82.70%</w:t>
             </w:r>
           </w:p>
         </w:tc>
@@ -1115,27 +1112,27 @@
           </w:tcPr>
           <w:p>
             <w:r>
-              <w:t>Region XIII</w:t>
-            </w:r>
-          </w:p>
-        </w:tc>
-        <w:tc>
-          <w:tcPr>
-            <w:tcW w:w="3504" w:type="dxa"/>
-          </w:tcPr>
-          <w:p>
-            <w:r>
-              <w:t>24</w:t>
-            </w:r>
-          </w:p>
-        </w:tc>
-        <w:tc>
-          <w:tcPr>
-            <w:tcW w:w="3504" w:type="dxa"/>
-          </w:tcPr>
-          <w:p>
-            <w:r>
-              <w:t>12.77%</w:t>
+              <w:t>Did not specify</w:t>
+            </w:r>
+          </w:p>
+        </w:tc>
+        <w:tc>
+          <w:tcPr>
+            <w:tcW w:w="3504" w:type="dxa"/>
+          </w:tcPr>
+          <w:p>
+            <w:r>
+              <w:t>73</w:t>
+            </w:r>
+          </w:p>
+        </w:tc>
+        <w:tc>
+          <w:tcPr>
+            <w:tcW w:w="3504" w:type="dxa"/>
+          </w:tcPr>
+          <w:p>
+            <w:r>
+              <w:t>17.30%</w:t>
             </w:r>
           </w:p>
         </w:tc>
@@ -1157,7 +1154,7 @@
           </w:tcPr>
           <w:p>
             <w:r>
-              <w:t>188</w:t>
+              <w:t>422</w:t>
             </w:r>
           </w:p>
         </w:tc>
@@ -1189,7 +1186,7 @@
           </w:tcPr>
           <w:p>
             <w:r>
-              <w:t>188 / 188</w:t>
+              <w:t>422 / 422</w:t>
             </w:r>
           </w:p>
         </w:tc>
@@ -1282,17 +1279,17 @@
           </w:tcPr>
           <w:p>
             <w:r>
-              <w:t>60</w:t>
-            </w:r>
-          </w:p>
-        </w:tc>
-        <w:tc>
-          <w:tcPr>
-            <w:tcW w:w="3504" w:type="dxa"/>
-          </w:tcPr>
-          <w:p>
-            <w:r>
-              <w:t>88.24%</w:t>
+              <w:t>212</w:t>
+            </w:r>
+          </w:p>
+        </w:tc>
+        <w:tc>
+          <w:tcPr>
+            <w:tcW w:w="3504" w:type="dxa"/>
+          </w:tcPr>
+          <w:p>
+            <w:r>
+              <w:t>80.30%</w:t>
             </w:r>
           </w:p>
         </w:tc>
@@ -1317,17 +1314,17 @@
           </w:tcPr>
           <w:p>
             <w:r>
-              <w:t>4</w:t>
-            </w:r>
-          </w:p>
-        </w:tc>
-        <w:tc>
-          <w:tcPr>
-            <w:tcW w:w="3504" w:type="dxa"/>
-          </w:tcPr>
-          <w:p>
-            <w:r>
-              <w:t>5.88%</w:t>
+              <w:t>19</w:t>
+            </w:r>
+          </w:p>
+        </w:tc>
+        <w:tc>
+          <w:tcPr>
+            <w:tcW w:w="3504" w:type="dxa"/>
+          </w:tcPr>
+          <w:p>
+            <w:r>
+              <w:t>7.20%</w:t>
             </w:r>
           </w:p>
         </w:tc>
@@ -1352,17 +1349,17 @@
           </w:tcPr>
           <w:p>
             <w:r>
-              <w:t>1</w:t>
-            </w:r>
-          </w:p>
-        </w:tc>
-        <w:tc>
-          <w:tcPr>
-            <w:tcW w:w="3504" w:type="dxa"/>
-          </w:tcPr>
-          <w:p>
-            <w:r>
-              <w:t>1.47%</w:t>
+              <w:t>13</w:t>
+            </w:r>
+          </w:p>
+        </w:tc>
+        <w:tc>
+          <w:tcPr>
+            <w:tcW w:w="3504" w:type="dxa"/>
+          </w:tcPr>
+          <w:p>
+            <w:r>
+              <w:t>4.92%</w:t>
             </w:r>
           </w:p>
         </w:tc>
@@ -1387,17 +1384,17 @@
           </w:tcPr>
           <w:p>
             <w:r>
-              <w:t>3</w:t>
-            </w:r>
-          </w:p>
-        </w:tc>
-        <w:tc>
-          <w:tcPr>
-            <w:tcW w:w="3504" w:type="dxa"/>
-          </w:tcPr>
-          <w:p>
-            <w:r>
-              <w:t>4.41%</w:t>
+              <w:t>20</w:t>
+            </w:r>
+          </w:p>
+        </w:tc>
+        <w:tc>
+          <w:tcPr>
+            <w:tcW w:w="3504" w:type="dxa"/>
+          </w:tcPr>
+          <w:p>
+            <w:r>
+              <w:t>7.58%</w:t>
             </w:r>
           </w:p>
         </w:tc>
@@ -1422,7 +1419,7 @@
           </w:tcPr>
           <w:p>
             <w:r>
-              <w:t>120</w:t>
+              <w:t>158</w:t>
             </w:r>
           </w:p>
         </w:tc>
@@ -1463,7 +1460,7 @@
               <w:rPr>
                 <w:b/>
               </w:rPr>
-              <w:t>188</w:t>
+              <w:t>422</w:t>
             </w:r>
           </w:p>
         </w:tc>
@@ -1501,7 +1498,7 @@
           </w:tcPr>
           <w:p>
             <w:r>
-              <w:t>68</w:t>
+              <w:t>264</w:t>
             </w:r>
           </w:p>
         </w:tc>
@@ -1621,17 +1618,17 @@
           </w:tcPr>
           <w:p>
             <w:r>
-              <w:t>59</w:t>
-            </w:r>
-          </w:p>
-        </w:tc>
-        <w:tc>
-          <w:tcPr>
-            <w:tcW w:w="3504" w:type="dxa"/>
-          </w:tcPr>
-          <w:p>
-            <w:r>
-              <w:t>89.39%</w:t>
+              <w:t>199</w:t>
+            </w:r>
+          </w:p>
+        </w:tc>
+        <w:tc>
+          <w:tcPr>
+            <w:tcW w:w="3504" w:type="dxa"/>
+          </w:tcPr>
+          <w:p>
+            <w:r>
+              <w:t>81.22%</w:t>
             </w:r>
           </w:p>
         </w:tc>
@@ -1656,17 +1653,17 @@
           </w:tcPr>
           <w:p>
             <w:r>
-              <w:t>4</w:t>
-            </w:r>
-          </w:p>
-        </w:tc>
-        <w:tc>
-          <w:tcPr>
-            <w:tcW w:w="3504" w:type="dxa"/>
-          </w:tcPr>
-          <w:p>
-            <w:r>
-              <w:t>6.06%</w:t>
+              <w:t>32</w:t>
+            </w:r>
+          </w:p>
+        </w:tc>
+        <w:tc>
+          <w:tcPr>
+            <w:tcW w:w="3504" w:type="dxa"/>
+          </w:tcPr>
+          <w:p>
+            <w:r>
+              <w:t>13.06%</w:t>
             </w:r>
           </w:p>
         </w:tc>
@@ -1691,17 +1688,17 @@
           </w:tcPr>
           <w:p>
             <w:r>
-              <w:t>1</w:t>
-            </w:r>
-          </w:p>
-        </w:tc>
-        <w:tc>
-          <w:tcPr>
-            <w:tcW w:w="3504" w:type="dxa"/>
-          </w:tcPr>
-          <w:p>
-            <w:r>
-              <w:t>1.52%</w:t>
+              <w:t>14</w:t>
+            </w:r>
+          </w:p>
+        </w:tc>
+        <w:tc>
+          <w:tcPr>
+            <w:tcW w:w="3504" w:type="dxa"/>
+          </w:tcPr>
+          <w:p>
+            <w:r>
+              <w:t>5.71%</w:t>
             </w:r>
           </w:p>
         </w:tc>
@@ -1726,17 +1723,17 @@
           </w:tcPr>
           <w:p>
             <w:r>
-              <w:t>2</w:t>
-            </w:r>
-          </w:p>
-        </w:tc>
-        <w:tc>
-          <w:tcPr>
-            <w:tcW w:w="3504" w:type="dxa"/>
-          </w:tcPr>
-          <w:p>
-            <w:r>
-              <w:t>3.03%</w:t>
+              <w:t>0</w:t>
+            </w:r>
+          </w:p>
+        </w:tc>
+        <w:tc>
+          <w:tcPr>
+            <w:tcW w:w="3504" w:type="dxa"/>
+          </w:tcPr>
+          <w:p>
+            <w:r>
+              <w:t>0.00%</w:t>
             </w:r>
           </w:p>
         </w:tc>
@@ -1761,7 +1758,7 @@
           </w:tcPr>
           <w:p>
             <w:r>
-              <w:t>122</w:t>
+              <w:t>177</w:t>
             </w:r>
           </w:p>
         </w:tc>
@@ -1802,7 +1799,7 @@
               <w:rPr>
                 <w:b/>
               </w:rPr>
-              <w:t>188</w:t>
+              <w:t>422</w:t>
             </w:r>
           </w:p>
         </w:tc>
@@ -1840,7 +1837,7 @@
           </w:tcPr>
           <w:p>
             <w:r>
-              <w:t>66</w:t>
+              <w:t>245</w:t>
             </w:r>
           </w:p>
         </w:tc>
@@ -1960,17 +1957,17 @@
           </w:tcPr>
           <w:p>
             <w:r>
-              <w:t>60</w:t>
-            </w:r>
-          </w:p>
-        </w:tc>
-        <w:tc>
-          <w:tcPr>
-            <w:tcW w:w="3504" w:type="dxa"/>
-          </w:tcPr>
-          <w:p>
-            <w:r>
-              <w:t>88.24%</w:t>
+              <w:t>203</w:t>
+            </w:r>
+          </w:p>
+        </w:tc>
+        <w:tc>
+          <w:tcPr>
+            <w:tcW w:w="3504" w:type="dxa"/>
+          </w:tcPr>
+          <w:p>
+            <w:r>
+              <w:t>77.48%</w:t>
             </w:r>
           </w:p>
         </w:tc>
@@ -1995,17 +1992,17 @@
           </w:tcPr>
           <w:p>
             <w:r>
-              <w:t>4</w:t>
-            </w:r>
-          </w:p>
-        </w:tc>
-        <w:tc>
-          <w:tcPr>
-            <w:tcW w:w="3504" w:type="dxa"/>
-          </w:tcPr>
-          <w:p>
-            <w:r>
-              <w:t>5.88%</w:t>
+              <w:t>32</w:t>
+            </w:r>
+          </w:p>
+        </w:tc>
+        <w:tc>
+          <w:tcPr>
+            <w:tcW w:w="3504" w:type="dxa"/>
+          </w:tcPr>
+          <w:p>
+            <w:r>
+              <w:t>12.21%</w:t>
             </w:r>
           </w:p>
         </w:tc>
@@ -2040,7 +2037,7 @@
           </w:tcPr>
           <w:p>
             <w:r>
-              <w:t>1.47%</w:t>
+              <w:t>0.38%</w:t>
             </w:r>
           </w:p>
         </w:tc>
@@ -2065,17 +2062,17 @@
           </w:tcPr>
           <w:p>
             <w:r>
-              <w:t>3</w:t>
-            </w:r>
-          </w:p>
-        </w:tc>
-        <w:tc>
-          <w:tcPr>
-            <w:tcW w:w="3504" w:type="dxa"/>
-          </w:tcPr>
-          <w:p>
-            <w:r>
-              <w:t>4.41%</w:t>
+              <w:t>26</w:t>
+            </w:r>
+          </w:p>
+        </w:tc>
+        <w:tc>
+          <w:tcPr>
+            <w:tcW w:w="3504" w:type="dxa"/>
+          </w:tcPr>
+          <w:p>
+            <w:r>
+              <w:t>9.92%</w:t>
             </w:r>
           </w:p>
         </w:tc>
@@ -2100,7 +2097,7 @@
           </w:tcPr>
           <w:p>
             <w:r>
-              <w:t>120</w:t>
+              <w:t>160</w:t>
             </w:r>
           </w:p>
         </w:tc>
@@ -2141,7 +2138,7 @@
               <w:rPr>
                 <w:b/>
               </w:rPr>
-              <w:t>188</w:t>
+              <w:t>422</w:t>
             </w:r>
           </w:p>
         </w:tc>
@@ -2179,7 +2176,7 @@
           </w:tcPr>
           <w:p>
             <w:r>
-              <w:t>68</w:t>
+              <w:t>262</w:t>
             </w:r>
           </w:p>
         </w:tc>
@@ -2369,7 +2366,7 @@
           </w:tcPr>
           <w:p>
             <w:r>
-              <w:t>146</w:t>
+              <w:t>259</w:t>
             </w:r>
           </w:p>
         </w:tc>
@@ -2379,7 +2376,7 @@
           </w:tcPr>
           <w:p>
             <w:r>
-              <w:t>35</w:t>
+              <w:t>135</w:t>
             </w:r>
           </w:p>
         </w:tc>
@@ -2389,6 +2386,16 @@
           </w:tcPr>
           <w:p>
             <w:r>
+              <w:t>10</w:t>
+            </w:r>
+          </w:p>
+        </w:tc>
+        <w:tc>
+          <w:tcPr>
+            <w:tcW w:w="1168" w:type="dxa"/>
+          </w:tcPr>
+          <w:p>
+            <w:r>
               <w:t>0</w:t>
             </w:r>
           </w:p>
@@ -2399,7 +2406,7 @@
           </w:tcPr>
           <w:p>
             <w:r>
-              <w:t>0</w:t>
+              <w:t>12</w:t>
             </w:r>
           </w:p>
         </w:tc>
@@ -2409,7 +2416,7 @@
           </w:tcPr>
           <w:p>
             <w:r>
-              <w:t>7</w:t>
+              <w:t>6</w:t>
             </w:r>
           </w:p>
         </w:tc>
@@ -2419,7 +2426,7 @@
           </w:tcPr>
           <w:p>
             <w:r>
-              <w:t>0</w:t>
+              <w:t>416</w:t>
             </w:r>
           </w:p>
         </w:tc>
@@ -2429,17 +2436,7 @@
           </w:tcPr>
           <w:p>
             <w:r>
-              <w:t>188</w:t>
-            </w:r>
-          </w:p>
-        </w:tc>
-        <w:tc>
-          <w:tcPr>
-            <w:tcW w:w="1168" w:type="dxa"/>
-          </w:tcPr>
-          <w:p>
-            <w:r>
-              <w:t>96.28%</w:t>
+              <w:t>94.71%</w:t>
             </w:r>
           </w:p>
         </w:tc>
@@ -2464,7 +2461,7 @@
           </w:tcPr>
           <w:p>
             <w:r>
-              <w:t>142</w:t>
+              <w:t>242</w:t>
             </w:r>
           </w:p>
         </w:tc>
@@ -2474,7 +2471,7 @@
           </w:tcPr>
           <w:p>
             <w:r>
-              <w:t>38</w:t>
+              <w:t>141</w:t>
             </w:r>
           </w:p>
         </w:tc>
@@ -2484,7 +2481,7 @@
           </w:tcPr>
           <w:p>
             <w:r>
-              <w:t>1</w:t>
+              <w:t>8</w:t>
             </w:r>
           </w:p>
         </w:tc>
@@ -2494,7 +2491,7 @@
           </w:tcPr>
           <w:p>
             <w:r>
-              <w:t>0</w:t>
+              <w:t>5</w:t>
             </w:r>
           </w:p>
         </w:tc>
@@ -2504,7 +2501,7 @@
           </w:tcPr>
           <w:p>
             <w:r>
-              <w:t>7</w:t>
+              <w:t>15</w:t>
             </w:r>
           </w:p>
         </w:tc>
@@ -2514,7 +2511,7 @@
           </w:tcPr>
           <w:p>
             <w:r>
-              <w:t>0</w:t>
+              <w:t>11</w:t>
             </w:r>
           </w:p>
         </w:tc>
@@ -2524,7 +2521,7 @@
           </w:tcPr>
           <w:p>
             <w:r>
-              <w:t>188</w:t>
+              <w:t>411</w:t>
             </w:r>
           </w:p>
         </w:tc>
@@ -2534,7 +2531,7 @@
           </w:tcPr>
           <w:p>
             <w:r>
-              <w:t>95.74%</w:t>
+              <w:t>93.19%</w:t>
             </w:r>
           </w:p>
         </w:tc>
@@ -2559,7 +2556,7 @@
           </w:tcPr>
           <w:p>
             <w:r>
-              <w:t>150</w:t>
+              <w:t>258</w:t>
             </w:r>
           </w:p>
         </w:tc>
@@ -2569,7 +2566,7 @@
           </w:tcPr>
           <w:p>
             <w:r>
-              <w:t>31</w:t>
+              <w:t>127</w:t>
             </w:r>
           </w:p>
         </w:tc>
@@ -2579,7 +2576,7 @@
           </w:tcPr>
           <w:p>
             <w:r>
-              <w:t>0</w:t>
+              <w:t>8</w:t>
             </w:r>
           </w:p>
         </w:tc>
@@ -2589,7 +2586,7 @@
           </w:tcPr>
           <w:p>
             <w:r>
-              <w:t>0</w:t>
+              <w:t>1</w:t>
             </w:r>
           </w:p>
         </w:tc>
@@ -2599,7 +2596,7 @@
           </w:tcPr>
           <w:p>
             <w:r>
-              <w:t>7</w:t>
+              <w:t>13</w:t>
             </w:r>
           </w:p>
         </w:tc>
@@ -2609,7 +2606,7 @@
           </w:tcPr>
           <w:p>
             <w:r>
-              <w:t>0</w:t>
+              <w:t>15</w:t>
             </w:r>
           </w:p>
         </w:tc>
@@ -2619,7 +2616,7 @@
           </w:tcPr>
           <w:p>
             <w:r>
-              <w:t>188</w:t>
+              <w:t>407</w:t>
             </w:r>
           </w:p>
         </w:tc>
@@ -2629,7 +2626,7 @@
           </w:tcPr>
           <w:p>
             <w:r>
-              <w:t>96.28%</w:t>
+              <w:t>94.59%</w:t>
             </w:r>
           </w:p>
         </w:tc>
@@ -2654,7 +2651,7 @@
           </w:tcPr>
           <w:p>
             <w:r>
-              <w:t>148</w:t>
+              <w:t>244</w:t>
             </w:r>
           </w:p>
         </w:tc>
@@ -2664,7 +2661,7 @@
           </w:tcPr>
           <w:p>
             <w:r>
-              <w:t>32</w:t>
+              <w:t>127</w:t>
             </w:r>
           </w:p>
         </w:tc>
@@ -2674,6 +2671,16 @@
           </w:tcPr>
           <w:p>
             <w:r>
+              <w:t>12</w:t>
+            </w:r>
+          </w:p>
+        </w:tc>
+        <w:tc>
+          <w:tcPr>
+            <w:tcW w:w="1168" w:type="dxa"/>
+          </w:tcPr>
+          <w:p>
+            <w:r>
               <w:t>1</w:t>
             </w:r>
           </w:p>
@@ -2684,7 +2691,7 @@
           </w:tcPr>
           <w:p>
             <w:r>
-              <w:t>0</w:t>
+              <w:t>10</w:t>
             </w:r>
           </w:p>
         </w:tc>
@@ -2694,7 +2701,7 @@
           </w:tcPr>
           <w:p>
             <w:r>
-              <w:t>7</w:t>
+              <w:t>28</w:t>
             </w:r>
           </w:p>
         </w:tc>
@@ -2704,7 +2711,7 @@
           </w:tcPr>
           <w:p>
             <w:r>
-              <w:t>0</w:t>
+              <w:t>394</w:t>
             </w:r>
           </w:p>
         </w:tc>
@@ -2714,17 +2721,7 @@
           </w:tcPr>
           <w:p>
             <w:r>
-              <w:t>188</w:t>
-            </w:r>
-          </w:p>
-        </w:tc>
-        <w:tc>
-          <w:tcPr>
-            <w:tcW w:w="1168" w:type="dxa"/>
-          </w:tcPr>
-          <w:p>
-            <w:r>
-              <w:t>95.74%</w:t>
+              <w:t>94.16%</w:t>
             </w:r>
           </w:p>
         </w:tc>
@@ -2749,7 +2746,7 @@
           </w:tcPr>
           <w:p>
             <w:r>
-              <w:t>146</w:t>
+              <w:t>239</w:t>
             </w:r>
           </w:p>
         </w:tc>
@@ -2759,7 +2756,7 @@
           </w:tcPr>
           <w:p>
             <w:r>
-              <w:t>33</w:t>
+              <w:t>111</w:t>
             </w:r>
           </w:p>
         </w:tc>
@@ -2769,7 +2766,7 @@
           </w:tcPr>
           <w:p>
             <w:r>
-              <w:t>2</w:t>
+              <w:t>10</w:t>
             </w:r>
           </w:p>
         </w:tc>
@@ -2779,7 +2776,7 @@
           </w:tcPr>
           <w:p>
             <w:r>
-              <w:t>0</w:t>
+              <w:t>1</w:t>
             </w:r>
           </w:p>
         </w:tc>
@@ -2789,7 +2786,7 @@
           </w:tcPr>
           <w:p>
             <w:r>
-              <w:t>7</w:t>
+              <w:t>10</w:t>
             </w:r>
           </w:p>
         </w:tc>
@@ -2799,7 +2796,7 @@
           </w:tcPr>
           <w:p>
             <w:r>
-              <w:t>0</w:t>
+              <w:t>51</w:t>
             </w:r>
           </w:p>
         </w:tc>
@@ -2809,7 +2806,7 @@
           </w:tcPr>
           <w:p>
             <w:r>
-              <w:t>188</w:t>
+              <w:t>371</w:t>
             </w:r>
           </w:p>
         </w:tc>
@@ -2819,7 +2816,7 @@
           </w:tcPr>
           <w:p>
             <w:r>
-              <w:t>95.21%</w:t>
+              <w:t>94.34%</w:t>
             </w:r>
           </w:p>
         </w:tc>
@@ -2854,6 +2851,26 @@
           </w:tcPr>
           <w:p>
             <w:r>
+              <w:t>1</w:t>
+            </w:r>
+          </w:p>
+        </w:tc>
+        <w:tc>
+          <w:tcPr>
+            <w:tcW w:w="1168" w:type="dxa"/>
+          </w:tcPr>
+          <w:p>
+            <w:r>
+              <w:t>1</w:t>
+            </w:r>
+          </w:p>
+        </w:tc>
+        <w:tc>
+          <w:tcPr>
+            <w:tcW w:w="1168" w:type="dxa"/>
+          </w:tcPr>
+          <w:p>
+            <w:r>
               <w:t>0</w:t>
             </w:r>
           </w:p>
@@ -2874,7 +2891,7 @@
           </w:tcPr>
           <w:p>
             <w:r>
-              <w:t>0</w:t>
+              <w:t>420</w:t>
             </w:r>
           </w:p>
         </w:tc>
@@ -2884,7 +2901,7 @@
           </w:tcPr>
           <w:p>
             <w:r>
-              <w:t>0</w:t>
+              <w:t>2</w:t>
             </w:r>
           </w:p>
         </w:tc>
@@ -2894,27 +2911,7 @@
           </w:tcPr>
           <w:p>
             <w:r>
-              <w:t>188</w:t>
-            </w:r>
-          </w:p>
-        </w:tc>
-        <w:tc>
-          <w:tcPr>
-            <w:tcW w:w="1168" w:type="dxa"/>
-          </w:tcPr>
-          <w:p>
-            <w:r>
-              <w:t>0</w:t>
-            </w:r>
-          </w:p>
-        </w:tc>
-        <w:tc>
-          <w:tcPr>
-            <w:tcW w:w="1168" w:type="dxa"/>
-          </w:tcPr>
-          <w:p>
-            <w:r>
-              <w:t>N/A</w:t>
+              <w:t>50.00%</w:t>
             </w:r>
           </w:p>
         </w:tc>
@@ -2939,7 +2936,7 @@
           </w:tcPr>
           <w:p>
             <w:r>
-              <w:t>151</w:t>
+              <w:t>264</w:t>
             </w:r>
           </w:p>
         </w:tc>
@@ -2949,7 +2946,7 @@
           </w:tcPr>
           <w:p>
             <w:r>
-              <w:t>28</w:t>
+              <w:t>119</w:t>
             </w:r>
           </w:p>
         </w:tc>
@@ -2959,6 +2956,16 @@
           </w:tcPr>
           <w:p>
             <w:r>
+              <w:t>3</w:t>
+            </w:r>
+          </w:p>
+        </w:tc>
+        <w:tc>
+          <w:tcPr>
+            <w:tcW w:w="1168" w:type="dxa"/>
+          </w:tcPr>
+          <w:p>
+            <w:r>
               <w:t>1</w:t>
             </w:r>
           </w:p>
@@ -2969,7 +2976,7 @@
           </w:tcPr>
           <w:p>
             <w:r>
-              <w:t>0</w:t>
+              <w:t>12</w:t>
             </w:r>
           </w:p>
         </w:tc>
@@ -2979,7 +2986,7 @@
           </w:tcPr>
           <w:p>
             <w:r>
-              <w:t>8</w:t>
+              <w:t>23</w:t>
             </w:r>
           </w:p>
         </w:tc>
@@ -2989,7 +2996,7 @@
           </w:tcPr>
           <w:p>
             <w:r>
-              <w:t>0</w:t>
+              <w:t>399</w:t>
             </w:r>
           </w:p>
         </w:tc>
@@ -2999,17 +3006,7 @@
           </w:tcPr>
           <w:p>
             <w:r>
-              <w:t>188</w:t>
-            </w:r>
-          </w:p>
-        </w:tc>
-        <w:tc>
-          <w:tcPr>
-            <w:tcW w:w="1168" w:type="dxa"/>
-          </w:tcPr>
-          <w:p>
-            <w:r>
-              <w:t>95.21%</w:t>
+              <w:t>95.99%</w:t>
             </w:r>
           </w:p>
         </w:tc>
@@ -3034,7 +3031,7 @@
           </w:tcPr>
           <w:p>
             <w:r>
-              <w:t>151</w:t>
+              <w:t>273</w:t>
             </w:r>
           </w:p>
         </w:tc>
@@ -3044,7 +3041,7 @@
           </w:tcPr>
           <w:p>
             <w:r>
-              <w:t>29</w:t>
+              <w:t>111</w:t>
             </w:r>
           </w:p>
         </w:tc>
@@ -3054,7 +3051,7 @@
           </w:tcPr>
           <w:p>
             <w:r>
-              <w:t>0</w:t>
+              <w:t>4</w:t>
             </w:r>
           </w:p>
         </w:tc>
@@ -3064,7 +3061,7 @@
           </w:tcPr>
           <w:p>
             <w:r>
-              <w:t>0</w:t>
+              <w:t>1</w:t>
             </w:r>
           </w:p>
         </w:tc>
@@ -3074,7 +3071,7 @@
           </w:tcPr>
           <w:p>
             <w:r>
-              <w:t>8</w:t>
+              <w:t>12</w:t>
             </w:r>
           </w:p>
         </w:tc>
@@ -3084,7 +3081,7 @@
           </w:tcPr>
           <w:p>
             <w:r>
-              <w:t>0</w:t>
+              <w:t>21</w:t>
             </w:r>
           </w:p>
         </w:tc>
@@ -3094,7 +3091,7 @@
           </w:tcPr>
           <w:p>
             <w:r>
-              <w:t>188</w:t>
+              <w:t>401</w:t>
             </w:r>
           </w:p>
         </w:tc>
@@ -3104,7 +3101,7 @@
           </w:tcPr>
           <w:p>
             <w:r>
-              <w:t>95.74%</w:t>
+              <w:t>95.76%</w:t>
             </w:r>
           </w:p>
         </w:tc>
@@ -3129,7 +3126,7 @@
           </w:tcPr>
           <w:p>
             <w:r>
-              <w:t>148</w:t>
+              <w:t>254</w:t>
             </w:r>
           </w:p>
         </w:tc>
@@ -3139,7 +3136,7 @@
           </w:tcPr>
           <w:p>
             <w:r>
-              <w:t>30</w:t>
+              <w:t>121</w:t>
             </w:r>
           </w:p>
         </w:tc>
@@ -3149,6 +3146,16 @@
           </w:tcPr>
           <w:p>
             <w:r>
+              <w:t>5</w:t>
+            </w:r>
+          </w:p>
+        </w:tc>
+        <w:tc>
+          <w:tcPr>
+            <w:tcW w:w="1168" w:type="dxa"/>
+          </w:tcPr>
+          <w:p>
+            <w:r>
               <w:t>2</w:t>
             </w:r>
           </w:p>
@@ -3159,7 +3166,7 @@
           </w:tcPr>
           <w:p>
             <w:r>
-              <w:t>0</w:t>
+              <w:t>12</w:t>
             </w:r>
           </w:p>
         </w:tc>
@@ -3169,7 +3176,7 @@
           </w:tcPr>
           <w:p>
             <w:r>
-              <w:t>8</w:t>
+              <w:t>28</w:t>
             </w:r>
           </w:p>
         </w:tc>
@@ -3179,7 +3186,7 @@
           </w:tcPr>
           <w:p>
             <w:r>
-              <w:t>0</w:t>
+              <w:t>394</w:t>
             </w:r>
           </w:p>
         </w:tc>
@@ -3189,17 +3196,7 @@
           </w:tcPr>
           <w:p>
             <w:r>
-              <w:t>188</w:t>
-            </w:r>
-          </w:p>
-        </w:tc>
-        <w:tc>
-          <w:tcPr>
-            <w:tcW w:w="1168" w:type="dxa"/>
-          </w:tcPr>
-          <w:p>
-            <w:r>
-              <w:t>94.68%</w:t>
+              <w:t>95.18%</w:t>
             </w:r>
           </w:p>
         </w:tc>
@@ -3389,31 +3386,31 @@
       </w:rPr>
     </w:lvl>
   </w:abstractNum>
-  <w:num w:numId="1" w16cid:durableId="1345739468">
+  <w:num w:numId="1" w16cid:durableId="1992980328">
     <w:abstractNumId w:val="8"/>
   </w:num>
-  <w:num w:numId="2" w16cid:durableId="1625384910">
+  <w:num w:numId="2" w16cid:durableId="1287464671">
     <w:abstractNumId w:val="6"/>
   </w:num>
-  <w:num w:numId="3" w16cid:durableId="330455080">
+  <w:num w:numId="3" w16cid:durableId="312178847">
     <w:abstractNumId w:val="5"/>
   </w:num>
-  <w:num w:numId="4" w16cid:durableId="155611124">
+  <w:num w:numId="4" w16cid:durableId="490295530">
     <w:abstractNumId w:val="4"/>
   </w:num>
-  <w:num w:numId="5" w16cid:durableId="1805080658">
+  <w:num w:numId="5" w16cid:durableId="1579244776">
     <w:abstractNumId w:val="7"/>
   </w:num>
-  <w:num w:numId="6" w16cid:durableId="1920863060">
+  <w:num w:numId="6" w16cid:durableId="1233659112">
     <w:abstractNumId w:val="3"/>
   </w:num>
-  <w:num w:numId="7" w16cid:durableId="1935362276">
+  <w:num w:numId="7" w16cid:durableId="1434590768">
     <w:abstractNumId w:val="2"/>
   </w:num>
-  <w:num w:numId="8" w16cid:durableId="1052658487">
+  <w:num w:numId="8" w16cid:durableId="356154278">
     <w:abstractNumId w:val="1"/>
   </w:num>
-  <w:num w:numId="9" w16cid:durableId="2070959303">
+  <w:num w:numId="9" w16cid:durableId="1781223521">
     <w:abstractNumId w:val="0"/>
   </w:num>
 </w:numbering>

</xml_diff>